<commit_message>
Nomenclature statement: name the manuscript, reconcile 131 entries to 128 variants
JMG requires an HGVS Nomenclature Verification document. The statement already
existed from an earlier submission and covers what they ask: HGNC symbols, MANE
Select transcripts on GRCh38, the numbering convention, mechanical validation of
every description with VariantValidator, and the two conversions that were
needed.

It said '131 source-level entries' while the manuscript says 128 variants. Both
are right: three variants were described independently in more than one source
and each description was verified separately. The statement now says so, because
a reviewer comparing the two documents would otherwise query it.
</commit_message>
<xml_diff>
--- a/publication/nomenclature_statement.docx
+++ b/publication/nomenclature_statement.docx
@@ -12,7 +12,7 @@
     </w:p>
     <w:p>
       <w:r>
-        <w:t>Submitted separately, as requested by the journal.</w:t>
+        <w:t>Submitted separately, as requested by the journal, in support of the manuscript "Predicting splicing variants in ADPKD: a functional benchmark of AlphaGenome and SpliceAI at *PKD1* and *PKD2*".</w:t>
       </w:r>
     </w:p>
     <w:p>
@@ -195,7 +195,7 @@
     </w:p>
     <w:p>
       <w:r>
-        <w:t>Descriptions follow the Human Genome Variation Society recommendations. Every description in this manuscript, its tables and its supplementary material was validated mechanically with VariantValidator against the transcripts above, which also supplied the genomic coordinates used for scoring. All 131 source-level entries passed. No description is carried over unchecked from its source publication.</w:t>
+        <w:t>Descriptions follow the Human Genome Variation Society recommendations. Every description in this manuscript, its tables and its supplementary material was validated mechanically with VariantValidator against the transcripts above, which also supplied the genomic coordinates used for scoring. All 131 source-level entries passed. Those 131 entries collapse to the 128 unique variants reported in the manuscript, because three variants were described independently in more than one source publication and each description was verified separately. No description is carried over unchecked from its source publication.</w:t>
       </w:r>
     </w:p>
     <w:p>

</xml_diff>